<commit_message>
fixing a few more things
</commit_message>
<xml_diff>
--- a/code/Stage2_Report_full.docx
+++ b/code/Stage2_Report_full.docx
@@ -2518,7 +2518,7 @@
         <w:pStyle w:val="authornote"/>
       </w:pPr>
       <w:r>
-        <w:t xml:space="preserve">The authors made the following contributions. Sau-Chin Chen: Conceptualization, Data curation, Formal analysis, Investigation, Methodology, Resources, Software, Supervision, Validation, Visualization, Writing - original draft, Writing - review &amp; editing; Erin Buchanan: Formal analysis, Project administration, Resources, Software, Validation, Writing - review &amp; editing; Zoltan Kekecs: Project administration, Writing - review &amp; editing; Jeremy K. Miller: Project administration, Resources, Supervision, Writing - review &amp; editing; Anna Szabelska: Project administration, Writing - original draft, Writing - review &amp; editing; Balazs Aczel: Investigation, Methodology, Resources, Writing - review &amp; editing; Pablo Bernabeu: Investigation, Methodology, Visualization, Writing - review &amp; editing; Patrick Forscher: Methodology, Writing - review &amp; editing; Attila Szuts: Investigation, Methodology, Resources, Writing - review &amp; editing; Zahir Vally: Investigation, Resources, Writing - review &amp; editing; Ali H. Al-Hoorie: Investigation, Resources, Writing - review &amp; editing; Mai Helmy: Investigation, Resources, Writing - review &amp; editing; Caio Santos Alves da Silva: Investigation, Resources, Writing - review &amp; editing; Luana Oliveira da Silva: Investigation, Resources, Writing - review &amp; editing; Yago Luksevicius de Moraes: Investigation, Resources, Writing - review &amp; editing; Rafael Ming Chi Santos Hsu: Investigation, Resources, Writing - review &amp; editing; Anthonieta Looman Mafra: Investigation, Resources, Writing - review &amp; editing; Jaroslava V. Valentova: Investigation, Resources, Writing - review &amp; editing; Marco Antonio Correa Varella: Investigation, Resources, Writing - review &amp; editing; Barnaby Dixson: Investigation, Writing - review &amp; editing; Kim Peters: Investigation, Writing - review &amp; editing; Nik Steffens: Investigation, Writing - review &amp; editing; Omid Ghasemi: Investigation, Writing - review &amp; editing; Andrew Roberts: Investigation, Writing - review &amp; editing; Robert M. Ross: Investigation, Writing - review &amp; editing; Ian D. Stephen: Investigation, Writing - review &amp; editing; Marina Milyavskaya: Investigation, Writing - review &amp; editing; Kelly Wang: Investigation, Writing - review &amp; editing; Kaitlyn M. Werner: Investigation, Writing - review &amp; editing; Dawn Liu Holford: Investigation, Writing - review &amp; editing; Miroslav Sirota: Investigation, Writing - review &amp; editing; Thomas Rhys Evans: Investigation, Writing - review &amp; editing; Dermot Lynott: Investigation, Writing - review &amp; editing; Bethany M. Lane: Investigation, Writing - review &amp; editing; Danny Riis Sahlholdt: Investigation, Writing - review &amp; editing; Glenn P. Williams: Investigation, Writing - review &amp; editing; Chrystalle B. Y. Tan: Investigation, Writing - review &amp; editing; Alicia Foo: Investigation, Writing - review &amp; editing; Steve M. J. Janssen: Investigation, Writing - review &amp; editing; Nwadiogo Chisom Arinze: Investigation, Writing - review &amp; editing; Izuchukwu Lawrence Gabriel Ndukaihe: Investigation, Writing - review &amp; editing; David Moreau: Investigation, Writing - review &amp; editing; Brianna Jurosic: Investigation, Writing - review &amp; editing; Brynna Leach: Investigation, Writing - review &amp; editing; Savannah Lewis: Investigation, Writing - review &amp; editing; Peter R. Mallik: Investigation, Writing - review &amp; editing; Kathleen Schmidt: Investigation, Resources, Writing - review &amp; editing; William J. Chopik: Investigation, Writing - review &amp; editing; Leigh Ann Vaughn: Investigation, Writing - review &amp; editing; Manyu Li: Investigation, Writing - review &amp; editing; Carmel A. Levitan: Investigation, Writing - review &amp; editing; Daniel Storage: Investigation, Writing - review &amp; editing; Carlota Batres: Investigation, Writing - review &amp; editing; Tyler McGee: Investigation, Writing - review &amp; editing; Janina Enachescu: Investigation, Resources, Writing - review &amp; editing; Jerome Olsen: Investigation, Resources, Writing - review &amp; editing; Martin Voracek: Investigation, Resources, Writing - review &amp; editing; Claus Lamm: Investigation, Resources, Writing - review &amp; editing; Ekaterina Pronizius: Investigation, Writing - review &amp; editing; Tilli Ripp: Investigation, Writing - review &amp; editing; Jan Philipp Röer: Investigation, Writing - review &amp; editing; Roxane Schnepper: Investigation, Writing - review &amp; editing; Marietta Papadatou-Pastou: Investigation, Resources, Writing - review &amp; editing; Aviv Mokady: Investigation, Resources, Writing - review &amp; editing; Niv Reggev: Investigation, Resources, Writing - review &amp; editing; Priyanka Chandel: Investigation, Resources, Writing - review &amp; editing; Pratibha Kujur: Investigation, Resources, Writing - review &amp; editing; Babita Pande: Investigation, Resources, Supervision, Writing - review &amp; editing; Arti Parganiha: Investigation, Resources, Supervision, Writing - review &amp; editing; Noorshama Parveen: Investigation, Resources, Writing - review &amp; editing; Sraddha Pradhan: Investigation, Resources, Writing - review &amp; editing; Margaret Messiah Singh: Investigation, Writing - review &amp; editing; Max Korbmacher: Investigation, Writing - review &amp; editing; Jonas R. Kunst: Investigation, Resources, Writing - review &amp; editing; Christian K. Tamnes: Investigation, Resources, Writing - review &amp; editing; Frederike S. Woelfert: Investigation, Writing - review &amp; editing; Kristoffer Klevjer: Investigation, Writing - review &amp; editing; Sarah E. Martiny: Investigation, Writing - review &amp; editing; Gerit Pfuhl: Investigation, Resources, Writing - review &amp; editing; Sylwia Adamus: Investigation, Resources, Writing - review &amp; editing; Krystian Barzykowski: Investigation, Resources, Supervision, Writing - review &amp; editing; Katarzyna Filip: Investigation, Resources, Writing - review &amp; editing; Patrícia Arriaga: Funding acquisition, Investigation, Resources, Writing - review &amp; editing; Vasilije Gvozdenović: Investigation, Resources, Writing - review &amp; editing; Vanja Ković: Investigation, Resources, Writing - review &amp; editing; Fei Gao: Investigation, Resources, Writing - review &amp; editing; Jingxiang Li: Investigation, Resources, Writing - review &amp; editing; Jozef Bavoľár: Investigation, Resources, Writing - review &amp; editing; Monika Hricová: Investigation, Resources, Writing - review &amp; editing; Pavol Kačmár: Investigation, Resources, Writing - review &amp; editing; Matúš Adamkovič: Investigation, Writing - review &amp; editing; Peter Babinčák: Investigation, Writing - review &amp; editing; Gabriel Baník: Investigation, Writing - review &amp; editing; Ivan Ropovik: Investigation, Writing - review &amp; editing; Danilo Zambrano Ricaurte: Investigation, Resources, Writing - review &amp; editing; Sara Álvarez-Solas: Investigation, Resources, Writing - review &amp; editing; Harry Manley: Investigation, Resources, Writing - review &amp; editing; Panita Suavansri: Investigation, Resources, Writing - review &amp; editing; Chun-Chia Kung: Investigation, Resources, Writing - review &amp; editing; Belemir Çoktok: Investigation, Resources, Writing - review &amp; editing; Asil Ali Özdoğru: Investigation, Resources, Writing - review &amp; editing; Çağlar Solak: Investigation, Writing - review &amp; editing; Sinem Söylemez: Investigation, Writing - review &amp; editing; Sami Çoksan: Investigation, Resources, Writing - review &amp; editing; İlker Dalgar: Resources, Writing - review &amp; editing; Mahmoud Elsherif: Writing - review &amp; editing; Martin Vasilev: Writing - review &amp; editing; Vinka Mlakic: Resources, Writing - review &amp; editing; Elisabeth Oberzaucher: Resources, Writing - review &amp; editing; Stefan Stieger: Resources, Writing - review &amp; editing; Selina Volsa: Resources, Writing - review &amp; editing; Janis Zickfeld: Resources, Writing - review &amp; editing; Christopher R. Chartier: Investigation, Project administration, Writing - review &amp; editing.</w:t>
+        <w:t xml:space="preserve">The authors made the following contributions. Sau-Chin Chen: Conceptualization, Data curation, Formal analysis, Investigation, Methodology, Resources, Software, Supervision, Validation, Visualization, Writing - original draft, Writing - review &amp; editing; Erin Buchanan: Formal analysis, Project administration, Resources, Software, Validation, Writing - review &amp; editing; Zoltan Kekecs: Project administration, Writing - review &amp; editing; Jeremy K. Miller: Project administration, Resources, Supervision, Writing - review &amp; editing; Anna Szabelska: Project administration, Writing - original draft, Writing - review &amp; editing; Balazs Aczel: Investigation, Methodology, Resources, Writing - review &amp; editing; Pablo Bernabeu: Investigation, Methodology, Visualization, Writing - review &amp; editing; Patrick Forscher: Methodology, Writing - review &amp; editing; Attila Szuts: Investigation, Methodology, Resources, Writing - review &amp; editing; Zahir Vally: Investigation, Resources, Writing - review &amp; editing; Ali H. Al-Hoorie: Investigation, Resources, Writing - review &amp; editing; Mai Helmy: Investigation, Resources, Writing - review &amp; editing; Caio Santos Alves da Silva: Investigation, Resources, Writing - review &amp; editing; Luana Oliveira da Silva: Investigation, Resources, Writing - review &amp; editing; Yago Luksevicius de Moraes: Investigation, Resources, Writing - review &amp; editing; Rafael Ming Chi Santos Hsu: Investigation, Resources, Writing - review &amp; editing; Anthonieta Looman Mafra: Investigation, Resources, Writing - review &amp; editing; Jaroslava V. Valentova: Investigation, Resources, Writing - review &amp; editing; Marco Antonio Correa Varella: Investigation, Resources, Writing - review &amp; editing; Barnaby Dixson: Investigation, Writing - review &amp; editing; Kim Peters: Investigation, Writing - review &amp; editing; Nik Steffens: Investigation, Writing - review &amp; editing; Omid Ghasemi: Investigation, Writing - review &amp; editing; Andrew Roberts: Investigation, Writing - review &amp; editing; Robert M. Ross: Investigation, Writing - review &amp; editing; Ian D. Stephen: Investigation, Writing - review &amp; editing; Marina Milyavskaya: Investigation, Writing - review &amp; editing; Kelly Wang: Investigation, Writing - review &amp; editing; Kaitlyn M. Werner: Investigation, Writing - review &amp; editing; Dawn Liu Holford: Investigation, Writing - review &amp; editing; Miroslav Sirota: Investigation, Writing - review &amp; editing; Thomas Rhys Evans: Investigation, Writing - review &amp; editing; Dermot Lynott: Investigation, Writing - review &amp; editing; Bethany M. Lane: Investigation, Writing - review &amp; editing; Danny Riis Sahlholdt: Investigation, Writing - review &amp; editing; Glenn P. Williams: Investigation, Writing - review &amp; editing; Chrystalle B. Y. Tan: Investigation, Writing - review &amp; editing; Alicia Foo: Investigation, Writing - review &amp; editing; Steve M. J. Janssen: Investigation, Writing - review &amp; editing; Nwadiogo Chisom Arinze: Investigation, Writing - review &amp; editing; Izuchukwu Lawrence Gabriel Ndukaihe: Investigation, Writing - review &amp; editing; David Moreau: Investigation, Writing - review &amp; editing; Brianna Jurosic: Investigation, Writing - review &amp; editing; Brynna Leach: Investigation, Writing - review &amp; editing; Savannah Lewis: Investigation, Writing - review &amp; editing; Peter R. Mallik: Investigation, Writing - review &amp; editing; Kathleen Schmidt: Investigation, Resources, Writing - review &amp; editing; William J. Chopik: Investigation, Writing - review &amp; editing; Leigh Ann Vaughn: Investigation, Writing - review &amp; editing; Manyu Li: Investigation, Writing - review &amp; editing; Carmel A. Levitan: Investigation, Writing - review &amp; editing; Daniel Storage: Investigation, Writing - review &amp; editing; Carlota Batres: Investigation, Writing - review &amp; editing; Tyler McGee: Investigation, Writing - review &amp; editing; Janina Enachescu: Investigation, Resources, Writing - review &amp; editing; Jerome Olsen: Investigation, Resources, Writing - review &amp; editing; Martin Voracek: Investigation, Resources, Writing - review &amp; editing; Claus Lamm: Investigation, Resources, Writing - review &amp; editing; Ekaterina Pronizius: Investigation, Writing - review &amp; editing; Tilli Ripp: Investigation, Writing - review &amp; editing; Jan Philipp Röer: Investigation, Writing - review &amp; editing; Roxane Schnepper: Investigation, Writing - review &amp; editing; Marietta Papadatou-Pastou: Investigation, Resources, Writing - review &amp; editing; Aviv Mokady: Investigation, Resources, Writing - review &amp; editing; Niv Reggev: Investigation, Resources, Writing - review &amp; editing; Priyanka Chandel: Investigation, Resources, Writing - review &amp; editing; Pratibha Kujur: Investigation, Resources, Writing - review &amp; editing; Babita Pande: Investigation, Resources, Supervision, Writing - review &amp; editing; Arti Parganiha: Investigation, Resources, Supervision, Writing - review &amp; editing; Noorshama Parveen: Investigation, Resources, Writing - review &amp; editing; Sraddha Pradhan: Investigation, Resources, Writing - review &amp; editing; Margaret Messiah Singh: Investigation, Writing - review &amp; editing; Max Korbmacher: Investigation, Writing - review &amp; editing; Jonas R. Kunst: Investigation, Resources, Writing - review &amp; editing; Christian K. Tamnes: Investigation, Resources, Writing - review &amp; editing; Frederike S. Woelfert: Investigation, Writing - review &amp; editing; Kristoffer Klevjer: Investigation, Writing - review &amp; editing; Sarah E. Martiny: Investigation, Writing - review &amp; editing; Gerit Pfuhl: Investigation, Resources, Writing - review &amp; editing; Sylwia Adamus: Investigation, Resources, Writing - review &amp; editing; Krystian Barzykowski: Investigation, Resources, Supervision, Writing - review &amp; editing; Katarzyna Filip: Investigation, Resources, Writing - review &amp; editing; Patrícia Arriaga: Funding acquisition, Investigation, Resources, Writing - review &amp; editing; Vasilije Gvozdenović: Investigation, Resources, Writing - review &amp; editing; Vanja Ković: Investigation, Resources, Writing - review &amp; editing; Fei Gao: Investigation, Resources, Writing - review &amp; editing; Jingxiang Li: Investigation, Resources, Writing - review &amp; editing; Jozef Bavoľár: Investigation, Resources, Writing - review &amp; editing; Monika Hricová: Investigation, Resources, Writing - review &amp; editing; Pavol Kačmár: Investigation, Resources, Writing - review &amp; editing; Matúš Adamkovič: Investigation, Writing - review &amp; editing; Peter Babinčák: Investigation, Writing - review &amp; editing; Gabriel Baník: Investigation, Writing - review &amp; editing; Ivan Ropovik: Investigation, Writing - review &amp; editing; Danilo Zambrano Ricaurte: Investigation, Resources, Writing - review &amp; editing; Sara Álvarez-Solas: Investigation, Resources, Writing - review &amp; editing; Harry Manley: Investigation, Resources, Writing - review &amp; editing; Panita Suavansri: Investigation, Resources, Writing - review &amp; editing; Chun-Chia Kung: Investigation, Resources, Writing - review &amp; editing; Belemir Çoktok: Investigation, Resources, Writing - review &amp; editing; Asil Ali Özdoğru: Investigation, Resources, Writing - review &amp; editing; Çağlar Solak: Investigation, Writing - review &amp; editing; Sinem Söylemez: Investigation, Writing - review &amp; editing; Sami Çoksan: Investigation, Resources, Writing - review &amp; editing; İlker Dalgar: Resources, Writing - review &amp; editing; Mahmoud Elsherif: Writing - review &amp; editing; Martin Vasilev: Writing - review &amp; editing; Vinka Mlakic: Resources, Writing - review &amp; editing; Elisabeth Oberzaucher: Resources, Writing - review &amp; editing; Stefan Stieger: Resources, Writing - review &amp; editing; Selina Volsa: Resources, Writing - review &amp; editing; Erica D. Musser: Investigation, Writing - review &amp; editing; Janis Zickfeld: Resources, Writing - review &amp; editing; Christopher R. Chartier: Investigation, Project administration, Writing - review &amp; editing.</w:t>
       </w:r>
     </w:p>
     <w:p>
@@ -2526,7 +2526,7 @@
         <w:pStyle w:val="authornote"/>
       </w:pPr>
       <w:r>
-        <w:t xml:space="preserve">Correspondence concerning this article should be addressed to Sau-Chin Chen, Enter postal address here. E-mail:</w:t>
+        <w:t xml:space="preserve">Correspondence concerning this article should be addressed to Sau-Chin Chen, No. 67, Jei-Ren St., Hualien City, Taiwan. E-mail:</w:t>
       </w:r>
       <w:r>
         <w:t xml:space="preserve"> </w:t>

</xml_diff>

<commit_message>
updating by request for the journal submission
</commit_message>
<xml_diff>
--- a/code/Stage2_Report_full.docx
+++ b/code/Stage2_Report_full.docx
@@ -2593,7 +2593,7 @@
         <w:t xml:space="preserve"> </w:t>
       </w:r>
       <w:r>
-        <w:t xml:space="preserve">(Ostarek &amp; Huettig, 2019; Scorolli, 2014)</w:t>
+        <w:t xml:space="preserve">(Ostarek &amp; Huettig, 2019)</w:t>
       </w:r>
       <w:r>
         <w:t xml:space="preserve">. Theoretical frameworks of conceptual processing describe the integration of linguistic representations and situated simulation</w:t>
@@ -2611,7 +2611,7 @@
         <w:t xml:space="preserve"> </w:t>
       </w:r>
       <w:r>
-        <w:t xml:space="preserve">(Barsalou, 1999; Wilson, 2002)</w:t>
+        <w:t xml:space="preserve">(Barsalou, 1999)</w:t>
       </w:r>
       <w:r>
         <w:t xml:space="preserve">, as cognition is thought to be an interaction of the body, environment, and processing</w:t>
@@ -13273,16 +13273,7 @@
         <w:t xml:space="preserve">(Kaschak &amp; Madden, 2021; McNamara, 2005)</w:t>
       </w:r>
       <w:r>
-        <w:t xml:space="preserve">. To scrutinize these effects, future studies could augment the sentence-picture verification task to compare the degree of priming based on object orientation with the priming based on other semantic information. The present study constitutes the first large-scale, cross-linguistic approach to the object orientation effect. Cross-linguistic studies are rare in the present topic, and generally in the topic of conceptual/semantic processing. In future studies, the basis for cross-linguistic comparisons in conceptual processing should be expanded, for instance, by studying the lexicosemantic features of the stimuli used, how those differ across languages, and how those differences may influence psycholinguistic processing. For the development of this founding work, the field of linguistic relativity may be useful as a model</w:t>
-      </w:r>
-      <w:r>
-        <w:t xml:space="preserve"> </w:t>
-      </w:r>
-      <w:r>
-        <w:t xml:space="preserve">(e.g., Athanasopoulos, 2023)</w:t>
-      </w:r>
-      <w:r>
-        <w:t xml:space="preserve">.</w:t>
+        <w:t xml:space="preserve">. To scrutinize these effects, future studies could augment the sentence-picture verification task to compare the degree of priming based on object orientation with the priming based on other semantic information. The present study constitutes the first large-scale, cross-linguistic approach to the object orientation effect. Cross-linguistic studies are rare in the present topic, and generally in the topic of conceptual/semantic processing. In future studies, the basis for cross-linguistic comparisons in conceptual processing should be expanded, for instance, by studying the lexicosemantic features of the stimuli used, how those differ across languages, and how those differences may influence psycholinguistic processing. For the development of this founding work, the field of linguistic relativity may be useful as a model.</w:t>
       </w:r>
     </w:p>
     <w:p>
@@ -13457,13 +13448,13 @@
       </w:r>
     </w:p>
     <w:bookmarkEnd w:id="63"/>
-    <w:bookmarkStart w:id="66" w:name="data-avaliability"/>
+    <w:bookmarkStart w:id="66" w:name="data-availability"/>
     <w:p>
       <w:pPr>
         <w:pStyle w:val="berschrift2"/>
       </w:pPr>
       <w:r>
-        <w:t xml:space="preserve">Data Avaliability</w:t>
+        <w:t xml:space="preserve">Data Availability</w:t>
       </w:r>
     </w:p>
     <w:p>
@@ -13539,7 +13530,7 @@
     </w:p>
     <w:bookmarkEnd w:id="67"/>
     <w:bookmarkEnd w:id="68"/>
-    <w:bookmarkStart w:id="162" w:name="references"/>
+    <w:bookmarkStart w:id="158" w:name="references"/>
     <w:p>
       <w:pPr>
         <w:pStyle w:val="berschrift1"/>
@@ -13548,39 +13539,13 @@
         <w:t xml:space="preserve">References</w:t>
       </w:r>
     </w:p>
-    <w:bookmarkStart w:id="161" w:name="refs"/>
-    <w:bookmarkStart w:id="69" w:name="ref-athanasopoulos2023"/>
+    <w:bookmarkStart w:id="157" w:name="refs"/>
+    <w:bookmarkStart w:id="70" w:name="ref-barsalouPerceptualSymbolSystems1999"/>
     <w:p>
       <w:pPr>
         <w:pStyle w:val="Literaturverzeichnis"/>
       </w:pPr>
       <w:r>
-        <w:t xml:space="preserve">Athanasopoulos, P. (2023).</w:t>
-      </w:r>
-      <w:r>
-        <w:t xml:space="preserve"> </w:t>
-      </w:r>
-      <w:r>
-        <w:rPr>
-          <w:i/>
-          <w:iCs/>
-        </w:rPr>
-        <w:t xml:space="preserve">Linguistic relativity</w:t>
-      </w:r>
-      <w:r>
-        <w:t xml:space="preserve"> </w:t>
-      </w:r>
-      <w:r>
-        <w:t xml:space="preserve">(J. Culpeper, Ed.; pp. 469–477). Routledge.</w:t>
-      </w:r>
-    </w:p>
-    <w:bookmarkEnd w:id="69"/>
-    <w:bookmarkStart w:id="71" w:name="ref-barsalouPerceptualSymbolSystems1999"/>
-    <w:p>
-      <w:pPr>
-        <w:pStyle w:val="Literaturverzeichnis"/>
-      </w:pPr>
-      <w:r>
         <w:t xml:space="preserve">Barsalou, L. W. (1999). Perceptual symbol systems.</w:t>
       </w:r>
       <w:r>
@@ -13612,7 +13577,7 @@
       <w:r>
         <w:t xml:space="preserve"> </w:t>
       </w:r>
-      <w:hyperlink r:id="rId70">
+      <w:hyperlink r:id="rId69">
         <w:r>
           <w:rPr>
             <w:rStyle w:val="Hyperlink"/>
@@ -13621,8 +13586,8 @@
         </w:r>
       </w:hyperlink>
     </w:p>
-    <w:bookmarkEnd w:id="71"/>
-    <w:bookmarkStart w:id="73" w:name="ref-barsalou_grounded_2008"/>
+    <w:bookmarkEnd w:id="70"/>
+    <w:bookmarkStart w:id="72" w:name="ref-barsalou_grounded_2008"/>
     <w:p>
       <w:pPr>
         <w:pStyle w:val="Literaturverzeichnis"/>
@@ -13659,7 +13624,7 @@
       <w:r>
         <w:t xml:space="preserve"> </w:t>
       </w:r>
-      <w:hyperlink r:id="rId72">
+      <w:hyperlink r:id="rId71">
         <w:r>
           <w:rPr>
             <w:rStyle w:val="Hyperlink"/>
@@ -13668,8 +13633,8 @@
         </w:r>
       </w:hyperlink>
     </w:p>
-    <w:bookmarkEnd w:id="73"/>
-    <w:bookmarkStart w:id="75" w:name="X771019d8c418e89e63d3492e82a2a2f5caf7c01"/>
+    <w:bookmarkEnd w:id="72"/>
+    <w:bookmarkStart w:id="74" w:name="X771019d8c418e89e63d3492e82a2a2f5caf7c01"/>
     <w:p>
       <w:pPr>
         <w:pStyle w:val="Literaturverzeichnis"/>
@@ -13706,7 +13671,7 @@
       <w:r>
         <w:t xml:space="preserve"> </w:t>
       </w:r>
-      <w:hyperlink r:id="rId74">
+      <w:hyperlink r:id="rId73">
         <w:r>
           <w:rPr>
             <w:rStyle w:val="Hyperlink"/>
@@ -13715,8 +13680,8 @@
         </w:r>
       </w:hyperlink>
     </w:p>
-    <w:bookmarkEnd w:id="75"/>
-    <w:bookmarkStart w:id="77" w:name="ref-barsalou2020"/>
+    <w:bookmarkEnd w:id="74"/>
+    <w:bookmarkStart w:id="76" w:name="ref-barsalou2020"/>
     <w:p>
       <w:pPr>
         <w:pStyle w:val="Literaturverzeichnis"/>
@@ -13753,7 +13718,7 @@
       <w:r>
         <w:t xml:space="preserve"> </w:t>
       </w:r>
-      <w:hyperlink r:id="rId76">
+      <w:hyperlink r:id="rId75">
         <w:r>
           <w:rPr>
             <w:rStyle w:val="Hyperlink"/>
@@ -13762,8 +13727,8 @@
         </w:r>
       </w:hyperlink>
     </w:p>
-    <w:bookmarkEnd w:id="77"/>
-    <w:bookmarkStart w:id="79" w:name="ref-bernabeu2022"/>
+    <w:bookmarkEnd w:id="76"/>
+    <w:bookmarkStart w:id="78" w:name="ref-bernabeu2022"/>
     <w:p>
       <w:pPr>
         <w:pStyle w:val="Literaturverzeichnis"/>
@@ -13787,7 +13752,7 @@
       <w:r>
         <w:t xml:space="preserve"> </w:t>
       </w:r>
-      <w:hyperlink r:id="rId78">
+      <w:hyperlink r:id="rId77">
         <w:r>
           <w:rPr>
             <w:rStyle w:val="Hyperlink"/>
@@ -13796,8 +13761,8 @@
         </w:r>
       </w:hyperlink>
     </w:p>
-    <w:bookmarkEnd w:id="79"/>
-    <w:bookmarkStart w:id="81" w:name="ref-bolker2015"/>
+    <w:bookmarkEnd w:id="78"/>
+    <w:bookmarkStart w:id="80" w:name="ref-bolker2015"/>
     <w:p>
       <w:pPr>
         <w:pStyle w:val="Literaturverzeichnis"/>
@@ -13824,7 +13789,7 @@
       <w:r>
         <w:t xml:space="preserve"> </w:t>
       </w:r>
-      <w:hyperlink r:id="rId80">
+      <w:hyperlink r:id="rId79">
         <w:r>
           <w:rPr>
             <w:rStyle w:val="Hyperlink"/>
@@ -13833,8 +13798,8 @@
         </w:r>
       </w:hyperlink>
     </w:p>
-    <w:bookmarkEnd w:id="81"/>
-    <w:bookmarkStart w:id="83" w:name="ref-chenDoesObjectSize2020"/>
+    <w:bookmarkEnd w:id="80"/>
+    <w:bookmarkStart w:id="82" w:name="ref-chenDoesObjectSize2020"/>
     <w:p>
       <w:pPr>
         <w:pStyle w:val="Literaturverzeichnis"/>
@@ -13871,7 +13836,7 @@
       <w:r>
         <w:t xml:space="preserve"> </w:t>
       </w:r>
-      <w:hyperlink r:id="rId82">
+      <w:hyperlink r:id="rId81">
         <w:r>
           <w:rPr>
             <w:rStyle w:val="Hyperlink"/>
@@ -13880,8 +13845,8 @@
         </w:r>
       </w:hyperlink>
     </w:p>
-    <w:bookmarkEnd w:id="83"/>
-    <w:bookmarkStart w:id="85" w:name="ref-chuSpontaneousGesturesMental2008"/>
+    <w:bookmarkEnd w:id="82"/>
+    <w:bookmarkStart w:id="84" w:name="ref-chuSpontaneousGesturesMental2008"/>
     <w:p>
       <w:pPr>
         <w:pStyle w:val="Literaturverzeichnis"/>
@@ -13930,7 +13895,7 @@
       <w:r>
         <w:t xml:space="preserve"> </w:t>
       </w:r>
-      <w:hyperlink r:id="rId84">
+      <w:hyperlink r:id="rId83">
         <w:r>
           <w:rPr>
             <w:rStyle w:val="Hyperlink"/>
@@ -13939,8 +13904,8 @@
         </w:r>
       </w:hyperlink>
     </w:p>
-    <w:bookmarkEnd w:id="85"/>
-    <w:bookmarkStart w:id="87" w:name="ref-cohenMentalRotationMental1993"/>
+    <w:bookmarkEnd w:id="84"/>
+    <w:bookmarkStart w:id="86" w:name="ref-cohenMentalRotationMental1993"/>
     <w:p>
       <w:pPr>
         <w:pStyle w:val="Literaturverzeichnis"/>
@@ -13977,7 +13942,7 @@
       <w:r>
         <w:t xml:space="preserve"> </w:t>
       </w:r>
-      <w:hyperlink r:id="rId86">
+      <w:hyperlink r:id="rId85">
         <w:r>
           <w:rPr>
             <w:rStyle w:val="Hyperlink"/>
@@ -13986,8 +13951,8 @@
         </w:r>
       </w:hyperlink>
     </w:p>
-    <w:bookmarkEnd w:id="87"/>
-    <w:bookmarkStart w:id="89" w:name="ref-connellRepresentingObjectColour2007"/>
+    <w:bookmarkEnd w:id="86"/>
+    <w:bookmarkStart w:id="88" w:name="ref-connellRepresentingObjectColour2007"/>
     <w:p>
       <w:pPr>
         <w:pStyle w:val="Literaturverzeichnis"/>
@@ -14024,7 +13989,7 @@
       <w:r>
         <w:t xml:space="preserve"> </w:t>
       </w:r>
-      <w:hyperlink r:id="rId88">
+      <w:hyperlink r:id="rId87">
         <w:r>
           <w:rPr>
             <w:rStyle w:val="Hyperlink"/>
@@ -14033,8 +13998,8 @@
         </w:r>
       </w:hyperlink>
     </w:p>
-    <w:bookmarkEnd w:id="89"/>
-    <w:bookmarkStart w:id="91" w:name="ref-koning_mental_2017"/>
+    <w:bookmarkEnd w:id="88"/>
+    <w:bookmarkStart w:id="90" w:name="ref-koning_mental_2017"/>
     <w:p>
       <w:pPr>
         <w:pStyle w:val="Literaturverzeichnis"/>
@@ -14071,7 +14036,7 @@
       <w:r>
         <w:t xml:space="preserve"> </w:t>
       </w:r>
-      <w:hyperlink r:id="rId90">
+      <w:hyperlink r:id="rId89">
         <w:r>
           <w:rPr>
             <w:rStyle w:val="Hyperlink"/>
@@ -14080,8 +14045,8 @@
         </w:r>
       </w:hyperlink>
     </w:p>
-    <w:bookmarkEnd w:id="91"/>
-    <w:bookmarkStart w:id="93" w:name="ref-dekoningSizeDoesMatter2017"/>
+    <w:bookmarkEnd w:id="90"/>
+    <w:bookmarkStart w:id="92" w:name="ref-dekoningSizeDoesMatter2017"/>
     <w:p>
       <w:pPr>
         <w:pStyle w:val="Literaturverzeichnis"/>
@@ -14130,7 +14095,7 @@
       <w:r>
         <w:t xml:space="preserve"> </w:t>
       </w:r>
-      <w:hyperlink r:id="rId92">
+      <w:hyperlink r:id="rId91">
         <w:r>
           <w:rPr>
             <w:rStyle w:val="Hyperlink"/>
@@ -14139,8 +14104,8 @@
         </w:r>
       </w:hyperlink>
     </w:p>
-    <w:bookmarkEnd w:id="93"/>
-    <w:bookmarkStart w:id="95" w:name="Xe3fd8b19a531c4d0e161acb5d4b49daa372816c"/>
+    <w:bookmarkEnd w:id="92"/>
+    <w:bookmarkStart w:id="94" w:name="Xe3fd8b19a531c4d0e161acb5d4b49daa372816c"/>
     <w:p>
       <w:pPr>
         <w:pStyle w:val="Literaturverzeichnis"/>
@@ -14177,7 +14142,7 @@
       <w:r>
         <w:t xml:space="preserve"> </w:t>
       </w:r>
-      <w:hyperlink r:id="rId94">
+      <w:hyperlink r:id="rId93">
         <w:r>
           <w:rPr>
             <w:rStyle w:val="Hyperlink"/>
@@ -14186,8 +14151,8 @@
         </w:r>
       </w:hyperlink>
     </w:p>
-    <w:bookmarkEnd w:id="95"/>
-    <w:bookmarkStart w:id="97" w:name="ref-fernandino2022"/>
+    <w:bookmarkEnd w:id="94"/>
+    <w:bookmarkStart w:id="96" w:name="ref-fernandino2022"/>
     <w:p>
       <w:pPr>
         <w:pStyle w:val="Literaturverzeichnis"/>
@@ -14224,7 +14189,7 @@
       <w:r>
         <w:t xml:space="preserve"> </w:t>
       </w:r>
-      <w:hyperlink r:id="rId96">
+      <w:hyperlink r:id="rId95">
         <w:r>
           <w:rPr>
             <w:rStyle w:val="Hyperlink"/>
@@ -14233,8 +14198,8 @@
         </w:r>
       </w:hyperlink>
     </w:p>
-    <w:bookmarkEnd w:id="97"/>
-    <w:bookmarkStart w:id="99" w:name="ref-frickMentalObjectRotation2013"/>
+    <w:bookmarkEnd w:id="96"/>
+    <w:bookmarkStart w:id="98" w:name="ref-frickMentalObjectRotation2013"/>
     <w:p>
       <w:pPr>
         <w:pStyle w:val="Literaturverzeichnis"/>
@@ -14271,7 +14236,7 @@
       <w:r>
         <w:t xml:space="preserve"> </w:t>
       </w:r>
-      <w:hyperlink r:id="rId98">
+      <w:hyperlink r:id="rId97">
         <w:r>
           <w:rPr>
             <w:rStyle w:val="Hyperlink"/>
@@ -14280,8 +14245,8 @@
         </w:r>
       </w:hyperlink>
     </w:p>
-    <w:bookmarkEnd w:id="99"/>
-    <w:bookmarkStart w:id="101" w:name="ref-kaschakEmbodimentLabTheory2021"/>
+    <w:bookmarkEnd w:id="98"/>
+    <w:bookmarkStart w:id="100" w:name="ref-kaschakEmbodimentLabTheory2021"/>
     <w:p>
       <w:pPr>
         <w:pStyle w:val="Literaturverzeichnis"/>
@@ -14367,7 +14332,7 @@
       <w:r>
         <w:t xml:space="preserve"> </w:t>
       </w:r>
-      <w:hyperlink r:id="rId100">
+      <w:hyperlink r:id="rId99">
         <w:r>
           <w:rPr>
             <w:rStyle w:val="Hyperlink"/>
@@ -14376,8 +14341,8 @@
         </w:r>
       </w:hyperlink>
     </w:p>
-    <w:bookmarkEnd w:id="101"/>
-    <w:bookmarkStart w:id="103" w:name="ref-kosterMentalSimulationObject2018"/>
+    <w:bookmarkEnd w:id="100"/>
+    <w:bookmarkStart w:id="102" w:name="ref-kosterMentalSimulationObject2018"/>
     <w:p>
       <w:pPr>
         <w:pStyle w:val="Literaturverzeichnis"/>
@@ -14426,7 +14391,7 @@
       <w:r>
         <w:t xml:space="preserve"> </w:t>
       </w:r>
-      <w:hyperlink r:id="rId102">
+      <w:hyperlink r:id="rId101">
         <w:r>
           <w:rPr>
             <w:rStyle w:val="Hyperlink"/>
@@ -14435,8 +14400,8 @@
         </w:r>
       </w:hyperlink>
     </w:p>
-    <w:bookmarkEnd w:id="103"/>
-    <w:bookmarkStart w:id="105" w:name="ref-liERPStudyMental2017"/>
+    <w:bookmarkEnd w:id="102"/>
+    <w:bookmarkStart w:id="104" w:name="ref-liERPStudyMental2017"/>
     <w:p>
       <w:pPr>
         <w:pStyle w:val="Literaturverzeichnis"/>
@@ -14482,7 +14447,7 @@
       <w:r>
         <w:t xml:space="preserve"> </w:t>
       </w:r>
-      <w:hyperlink r:id="rId104">
+      <w:hyperlink r:id="rId103">
         <w:r>
           <w:rPr>
             <w:rStyle w:val="Hyperlink"/>
@@ -14491,8 +14456,8 @@
         </w:r>
       </w:hyperlink>
     </w:p>
-    <w:bookmarkEnd w:id="105"/>
-    <w:bookmarkStart w:id="107" w:name="ref-lokenMeasurementErrorReplication2017"/>
+    <w:bookmarkEnd w:id="104"/>
+    <w:bookmarkStart w:id="106" w:name="ref-lokenMeasurementErrorReplication2017"/>
     <w:p>
       <w:pPr>
         <w:pStyle w:val="Literaturverzeichnis"/>
@@ -14529,7 +14494,7 @@
       <w:r>
         <w:t xml:space="preserve"> </w:t>
       </w:r>
-      <w:hyperlink r:id="rId106">
+      <w:hyperlink r:id="rId105">
         <w:r>
           <w:rPr>
             <w:rStyle w:val="Hyperlink"/>
@@ -14538,8 +14503,8 @@
         </w:r>
       </w:hyperlink>
     </w:p>
-    <w:bookmarkEnd w:id="107"/>
-    <w:bookmarkStart w:id="109" w:name="ref-louwerse2015"/>
+    <w:bookmarkEnd w:id="106"/>
+    <w:bookmarkStart w:id="108" w:name="ref-louwerse2015"/>
     <w:p>
       <w:pPr>
         <w:pStyle w:val="Literaturverzeichnis"/>
@@ -14576,7 +14541,7 @@
       <w:r>
         <w:t xml:space="preserve"> </w:t>
       </w:r>
-      <w:hyperlink r:id="rId108">
+      <w:hyperlink r:id="rId107">
         <w:r>
           <w:rPr>
             <w:rStyle w:val="Hyperlink"/>
@@ -14585,8 +14550,8 @@
         </w:r>
       </w:hyperlink>
     </w:p>
-    <w:bookmarkEnd w:id="109"/>
-    <w:bookmarkStart w:id="111" w:name="X005d9e29f642880f32112bcf7d163ce9e6ad9f0"/>
+    <w:bookmarkEnd w:id="108"/>
+    <w:bookmarkStart w:id="110" w:name="X005d9e29f642880f32112bcf7d163ce9e6ad9f0"/>
     <w:p>
       <w:pPr>
         <w:pStyle w:val="Literaturverzeichnis"/>
@@ -14644,7 +14609,7 @@
       <w:r>
         <w:t xml:space="preserve"> </w:t>
       </w:r>
-      <w:hyperlink r:id="rId110">
+      <w:hyperlink r:id="rId109">
         <w:r>
           <w:rPr>
             <w:rStyle w:val="Hyperlink"/>
@@ -14653,8 +14618,8 @@
         </w:r>
       </w:hyperlink>
     </w:p>
-    <w:bookmarkEnd w:id="111"/>
-    <w:bookmarkStart w:id="112" w:name="X8f274bcd75501f6d145cd99a9071c492373cbdf"/>
+    <w:bookmarkEnd w:id="110"/>
+    <w:bookmarkStart w:id="111" w:name="X8f274bcd75501f6d145cd99a9071c492373cbdf"/>
     <w:p>
       <w:pPr>
         <w:pStyle w:val="Literaturverzeichnis"/>
@@ -14748,8 +14713,8 @@
         <w:t xml:space="preserve">.</w:t>
       </w:r>
     </w:p>
-    <w:bookmarkEnd w:id="112"/>
-    <w:bookmarkStart w:id="114" w:name="ref-morey2022"/>
+    <w:bookmarkEnd w:id="111"/>
+    <w:bookmarkStart w:id="113" w:name="ref-morey2022"/>
     <w:p>
       <w:pPr>
         <w:pStyle w:val="Literaturverzeichnis"/>
@@ -14786,7 +14751,7 @@
       <w:r>
         <w:t xml:space="preserve"> </w:t>
       </w:r>
-      <w:hyperlink r:id="rId113">
+      <w:hyperlink r:id="rId112">
         <w:r>
           <w:rPr>
             <w:rStyle w:val="Hyperlink"/>
@@ -14795,8 +14760,8 @@
         </w:r>
       </w:hyperlink>
     </w:p>
-    <w:bookmarkEnd w:id="114"/>
-    <w:bookmarkStart w:id="116" w:name="X540d3d95119d2b1ec8e2d37faa018c7662d4f8a"/>
+    <w:bookmarkEnd w:id="113"/>
+    <w:bookmarkStart w:id="115" w:name="X540d3d95119d2b1ec8e2d37faa018c7662d4f8a"/>
     <w:p>
       <w:pPr>
         <w:pStyle w:val="Literaturverzeichnis"/>
@@ -14854,7 +14819,7 @@
       <w:r>
         <w:t xml:space="preserve"> </w:t>
       </w:r>
-      <w:hyperlink r:id="rId115">
+      <w:hyperlink r:id="rId114">
         <w:r>
           <w:rPr>
             <w:rStyle w:val="Hyperlink"/>
@@ -14863,8 +14828,8 @@
         </w:r>
       </w:hyperlink>
     </w:p>
-    <w:bookmarkEnd w:id="116"/>
-    <w:bookmarkStart w:id="118" w:name="X5a8c980f3ef2c3ec0b9c301d0273c379998c7d9"/>
+    <w:bookmarkEnd w:id="115"/>
+    <w:bookmarkStart w:id="117" w:name="X5a8c980f3ef2c3ec0b9c301d0273c379998c7d9"/>
     <w:p>
       <w:pPr>
         <w:pStyle w:val="Literaturverzeichnis"/>
@@ -15002,7 +14967,7 @@
       <w:r>
         <w:t xml:space="preserve"> </w:t>
       </w:r>
-      <w:hyperlink r:id="rId117">
+      <w:hyperlink r:id="rId116">
         <w:r>
           <w:rPr>
             <w:rStyle w:val="Hyperlink"/>
@@ -15011,8 +14976,8 @@
         </w:r>
       </w:hyperlink>
     </w:p>
-    <w:bookmarkEnd w:id="118"/>
-    <w:bookmarkStart w:id="120" w:name="ref-noah2018"/>
+    <w:bookmarkEnd w:id="117"/>
+    <w:bookmarkStart w:id="119" w:name="ref-noah2018"/>
     <w:p>
       <w:pPr>
         <w:pStyle w:val="Literaturverzeichnis"/>
@@ -15049,7 +15014,7 @@
       <w:r>
         <w:t xml:space="preserve"> </w:t>
       </w:r>
-      <w:hyperlink r:id="rId119">
+      <w:hyperlink r:id="rId118">
         <w:r>
           <w:rPr>
             <w:rStyle w:val="Hyperlink"/>
@@ -15058,8 +15023,8 @@
         </w:r>
       </w:hyperlink>
     </w:p>
-    <w:bookmarkEnd w:id="120"/>
-    <w:bookmarkStart w:id="122" w:name="ref-ostarekSixChallengesEmbodiment2019"/>
+    <w:bookmarkEnd w:id="119"/>
+    <w:bookmarkStart w:id="121" w:name="ref-ostarekSixChallengesEmbodiment2019"/>
     <w:p>
       <w:pPr>
         <w:pStyle w:val="Literaturverzeichnis"/>
@@ -15105,7 +15070,7 @@
       <w:r>
         <w:t xml:space="preserve"> </w:t>
       </w:r>
-      <w:hyperlink r:id="rId121">
+      <w:hyperlink r:id="rId120">
         <w:r>
           <w:rPr>
             <w:rStyle w:val="Hyperlink"/>
@@ -15114,8 +15079,8 @@
         </w:r>
       </w:hyperlink>
     </w:p>
-    <w:bookmarkEnd w:id="122"/>
-    <w:bookmarkStart w:id="124" w:name="X1970d58ff19d287fead20eda837cf04a09ca7de"/>
+    <w:bookmarkEnd w:id="121"/>
+    <w:bookmarkStart w:id="123" w:name="X1970d58ff19d287fead20eda837cf04a09ca7de"/>
     <w:p>
       <w:pPr>
         <w:pStyle w:val="Literaturverzeichnis"/>
@@ -15152,7 +15117,7 @@
       <w:r>
         <w:t xml:space="preserve"> </w:t>
       </w:r>
-      <w:hyperlink r:id="rId123">
+      <w:hyperlink r:id="rId122">
         <w:r>
           <w:rPr>
             <w:rStyle w:val="Hyperlink"/>
@@ -15161,8 +15126,8 @@
         </w:r>
       </w:hyperlink>
     </w:p>
-    <w:bookmarkEnd w:id="124"/>
-    <w:bookmarkStart w:id="126" w:name="ref-pouwMoreEmbeddedExtended2014"/>
+    <w:bookmarkEnd w:id="123"/>
+    <w:bookmarkStart w:id="125" w:name="ref-pouwMoreEmbeddedExtended2014"/>
     <w:p>
       <w:pPr>
         <w:pStyle w:val="Literaturverzeichnis"/>
@@ -15199,7 +15164,7 @@
       <w:r>
         <w:t xml:space="preserve"> </w:t>
       </w:r>
-      <w:hyperlink r:id="rId125">
+      <w:hyperlink r:id="rId124">
         <w:r>
           <w:rPr>
             <w:rStyle w:val="Hyperlink"/>
@@ -15208,8 +15173,8 @@
         </w:r>
       </w:hyperlink>
     </w:p>
-    <w:bookmarkEnd w:id="126"/>
-    <w:bookmarkStart w:id="128" w:name="ref-roelke2018"/>
+    <w:bookmarkEnd w:id="125"/>
+    <w:bookmarkStart w:id="127" w:name="ref-roelke2018"/>
     <w:p>
       <w:pPr>
         <w:pStyle w:val="Literaturverzeichnis"/>
@@ -15246,7 +15211,7 @@
       <w:r>
         <w:t xml:space="preserve"> </w:t>
       </w:r>
-      <w:hyperlink r:id="rId127">
+      <w:hyperlink r:id="rId126">
         <w:r>
           <w:rPr>
             <w:rStyle w:val="Hyperlink"/>
@@ -15255,8 +15220,8 @@
         </w:r>
       </w:hyperlink>
     </w:p>
-    <w:bookmarkEnd w:id="128"/>
-    <w:bookmarkStart w:id="130" w:name="ref-rommersObjectShapeOrientation2013"/>
+    <w:bookmarkEnd w:id="127"/>
+    <w:bookmarkStart w:id="129" w:name="ref-rommersObjectShapeOrientation2013"/>
     <w:p>
       <w:pPr>
         <w:pStyle w:val="Literaturverzeichnis"/>
@@ -15293,7 +15258,7 @@
       <w:r>
         <w:t xml:space="preserve"> </w:t>
       </w:r>
-      <w:hyperlink r:id="rId129">
+      <w:hyperlink r:id="rId128">
         <w:r>
           <w:rPr>
             <w:rStyle w:val="Hyperlink"/>
@@ -15302,8 +15267,8 @@
         </w:r>
       </w:hyperlink>
     </w:p>
-    <w:bookmarkEnd w:id="130"/>
-    <w:bookmarkStart w:id="132" w:name="ref-satoOneWordTime2013"/>
+    <w:bookmarkEnd w:id="129"/>
+    <w:bookmarkStart w:id="131" w:name="ref-satoOneWordTime2013"/>
     <w:p>
       <w:pPr>
         <w:pStyle w:val="Literaturverzeichnis"/>
@@ -15352,7 +15317,7 @@
       <w:r>
         <w:t xml:space="preserve"> </w:t>
       </w:r>
-      <w:hyperlink r:id="rId131">
+      <w:hyperlink r:id="rId130">
         <w:r>
           <w:rPr>
             <w:rStyle w:val="Hyperlink"/>
@@ -15361,99 +15326,36 @@
         </w:r>
       </w:hyperlink>
     </w:p>
-    <w:bookmarkEnd w:id="132"/>
-    <w:bookmarkStart w:id="133" w:name="ref-scorolli2014embodiment"/>
+    <w:bookmarkEnd w:id="131"/>
+    <w:bookmarkStart w:id="133" w:name="ref-seticNumericalCongruencyEffect2017"/>
     <w:p>
       <w:pPr>
         <w:pStyle w:val="Literaturverzeichnis"/>
       </w:pPr>
       <w:r>
-        <w:t xml:space="preserve">Scorolli, C. (2014). Embodiment and language. In L. Shapiro (Ed.),</w:t>
-      </w:r>
-      <w:r>
-        <w:t xml:space="preserve"> </w:t>
-      </w:r>
-      <w:r>
-        <w:rPr>
-          <w:i/>
-          <w:iCs/>
-        </w:rPr>
-        <w:t xml:space="preserve">The</w:t>
-      </w:r>
-      <w:r>
-        <w:rPr>
-          <w:i/>
-          <w:iCs/>
-        </w:rPr>
-        <w:t xml:space="preserve"> </w:t>
-      </w:r>
-      <w:r>
-        <w:rPr>
-          <w:i/>
-          <w:iCs/>
-        </w:rPr>
-        <w:t xml:space="preserve">Routledge</w:t>
-      </w:r>
-      <w:r>
-        <w:rPr>
-          <w:i/>
-          <w:iCs/>
-        </w:rPr>
-        <w:t xml:space="preserve"> </w:t>
-      </w:r>
-      <w:r>
-        <w:rPr>
-          <w:i/>
-          <w:iCs/>
-        </w:rPr>
-        <w:t xml:space="preserve">handbook of embodied cognition</w:t>
-      </w:r>
-      <w:r>
-        <w:t xml:space="preserve"> </w:t>
-      </w:r>
-      <w:r>
-        <w:t xml:space="preserve">(pp. 145–156).</w:t>
-      </w:r>
-      <w:r>
-        <w:t xml:space="preserve"> </w:t>
-      </w:r>
-      <w:r>
-        <w:t xml:space="preserve">Routledge</w:t>
+        <w:t xml:space="preserve">Šetić, M., &amp; Domijan, D. (2017). Numerical</w:t>
+      </w:r>
+      <w:r>
+        <w:t xml:space="preserve"> </w:t>
+      </w:r>
+      <w:r>
+        <w:t xml:space="preserve">congruency effect</w:t>
+      </w:r>
+      <w:r>
+        <w:t xml:space="preserve"> </w:t>
+      </w:r>
+      <w:r>
+        <w:t xml:space="preserve">in the</w:t>
+      </w:r>
+      <w:r>
+        <w:t xml:space="preserve"> </w:t>
+      </w:r>
+      <w:r>
+        <w:t xml:space="preserve">sentence-picture verification task</w:t>
       </w:r>
       <w:r>
         <w:t xml:space="preserve">.</w:t>
       </w:r>
-    </w:p>
-    <w:bookmarkEnd w:id="133"/>
-    <w:bookmarkStart w:id="135" w:name="ref-seticNumericalCongruencyEffect2017"/>
-    <w:p>
-      <w:pPr>
-        <w:pStyle w:val="Literaturverzeichnis"/>
-      </w:pPr>
-      <w:r>
-        <w:t xml:space="preserve">Šetić, M., &amp; Domijan, D. (2017). Numerical</w:t>
-      </w:r>
-      <w:r>
-        <w:t xml:space="preserve"> </w:t>
-      </w:r>
-      <w:r>
-        <w:t xml:space="preserve">congruency effect</w:t>
-      </w:r>
-      <w:r>
-        <w:t xml:space="preserve"> </w:t>
-      </w:r>
-      <w:r>
-        <w:t xml:space="preserve">in the</w:t>
-      </w:r>
-      <w:r>
-        <w:t xml:space="preserve"> </w:t>
-      </w:r>
-      <w:r>
-        <w:t xml:space="preserve">sentence-picture verification task</w:t>
-      </w:r>
-      <w:r>
-        <w:t xml:space="preserve">.</w:t>
-      </w:r>
       <w:r>
         <w:t xml:space="preserve"> </w:t>
       </w:r>
@@ -15483,7 +15385,7 @@
       <w:r>
         <w:t xml:space="preserve"> </w:t>
       </w:r>
-      <w:hyperlink r:id="rId134">
+      <w:hyperlink r:id="rId132">
         <w:r>
           <w:rPr>
             <w:rStyle w:val="Hyperlink"/>
@@ -15492,8 +15394,8 @@
         </w:r>
       </w:hyperlink>
     </w:p>
-    <w:bookmarkEnd w:id="135"/>
-    <w:bookmarkStart w:id="137" w:name="ref-stanfield_effect_2001"/>
+    <w:bookmarkEnd w:id="133"/>
+    <w:bookmarkStart w:id="135" w:name="ref-stanfield_effect_2001"/>
     <w:p>
       <w:pPr>
         <w:pStyle w:val="Literaturverzeichnis"/>
@@ -15530,7 +15432,7 @@
       <w:r>
         <w:t xml:space="preserve"> </w:t>
       </w:r>
-      <w:hyperlink r:id="rId136">
+      <w:hyperlink r:id="rId134">
         <w:r>
           <w:rPr>
             <w:rStyle w:val="Hyperlink"/>
@@ -15539,8 +15441,8 @@
         </w:r>
       </w:hyperlink>
     </w:p>
-    <w:bookmarkEnd w:id="137"/>
-    <w:bookmarkStart w:id="139" w:name="ref-tong2022"/>
+    <w:bookmarkEnd w:id="135"/>
+    <w:bookmarkStart w:id="137" w:name="ref-tong2022"/>
     <w:p>
       <w:pPr>
         <w:pStyle w:val="Literaturverzeichnis"/>
@@ -15577,7 +15479,7 @@
       <w:r>
         <w:t xml:space="preserve"> </w:t>
       </w:r>
-      <w:hyperlink r:id="rId138">
+      <w:hyperlink r:id="rId136">
         <w:r>
           <w:rPr>
             <w:rStyle w:val="Hyperlink"/>
@@ -15586,8 +15488,8 @@
         </w:r>
       </w:hyperlink>
     </w:p>
-    <w:bookmarkEnd w:id="139"/>
-    <w:bookmarkStart w:id="141" w:name="ref-vasishth2021"/>
+    <w:bookmarkEnd w:id="137"/>
+    <w:bookmarkStart w:id="139" w:name="ref-vasishth2021"/>
     <w:p>
       <w:pPr>
         <w:pStyle w:val="Literaturverzeichnis"/>
@@ -15624,7 +15526,7 @@
       <w:r>
         <w:t xml:space="preserve"> </w:t>
       </w:r>
-      <w:hyperlink r:id="rId140">
+      <w:hyperlink r:id="rId138">
         <w:r>
           <w:rPr>
             <w:rStyle w:val="Hyperlink"/>
@@ -15633,8 +15535,8 @@
         </w:r>
       </w:hyperlink>
     </w:p>
-    <w:bookmarkEnd w:id="141"/>
-    <w:bookmarkStart w:id="143" w:name="ref-vazire2018"/>
+    <w:bookmarkEnd w:id="139"/>
+    <w:bookmarkStart w:id="141" w:name="ref-vazire2018"/>
     <w:p>
       <w:pPr>
         <w:pStyle w:val="Literaturverzeichnis"/>
@@ -15671,7 +15573,7 @@
       <w:r>
         <w:t xml:space="preserve"> </w:t>
       </w:r>
-      <w:hyperlink r:id="rId142">
+      <w:hyperlink r:id="rId140">
         <w:r>
           <w:rPr>
             <w:rStyle w:val="Hyperlink"/>
@@ -15680,8 +15582,8 @@
         </w:r>
       </w:hyperlink>
     </w:p>
-    <w:bookmarkEnd w:id="143"/>
-    <w:bookmarkStart w:id="145" w:name="ref-verkerk2014"/>
+    <w:bookmarkEnd w:id="141"/>
+    <w:bookmarkStart w:id="143" w:name="ref-verkerk2014"/>
     <w:p>
       <w:pPr>
         <w:pStyle w:val="Literaturverzeichnis"/>
@@ -15718,7 +15620,7 @@
       <w:r>
         <w:t xml:space="preserve"> </w:t>
       </w:r>
-      <w:hyperlink r:id="rId144">
+      <w:hyperlink r:id="rId142">
         <w:r>
           <w:rPr>
             <w:rStyle w:val="Hyperlink"/>
@@ -15727,24 +15629,24 @@
         </w:r>
       </w:hyperlink>
     </w:p>
-    <w:bookmarkEnd w:id="145"/>
-    <w:bookmarkStart w:id="147" w:name="ref-wilson2002"/>
+    <w:bookmarkEnd w:id="143"/>
+    <w:bookmarkStart w:id="145" w:name="ref-zwaan_embodiment_2014"/>
     <w:p>
       <w:pPr>
         <w:pStyle w:val="Literaturverzeichnis"/>
       </w:pPr>
       <w:r>
-        <w:t xml:space="preserve">Wilson, M. (2002). Six views of embodied cognition.</w:t>
-      </w:r>
-      <w:r>
-        <w:t xml:space="preserve"> </w:t>
-      </w:r>
-      <w:r>
-        <w:rPr>
-          <w:i/>
-          <w:iCs/>
-        </w:rPr>
-        <w:t xml:space="preserve">Psychonomic Bulletin &amp; Review</w:t>
+        <w:t xml:space="preserve">Zwaan, R. A. (2014a). Embodiment and language comprehension: Reframing the discussion.</w:t>
+      </w:r>
+      <w:r>
+        <w:t xml:space="preserve"> </w:t>
+      </w:r>
+      <w:r>
+        <w:rPr>
+          <w:i/>
+          <w:iCs/>
+        </w:rPr>
+        <w:t xml:space="preserve">Trends in Cognitive Sciences</w:t>
       </w:r>
       <w:r>
         <w:t xml:space="preserve">,</w:t>
@@ -15757,53 +15659,6 @@
           <w:i/>
           <w:iCs/>
         </w:rPr>
-        <w:t xml:space="preserve">9</w:t>
-      </w:r>
-      <w:r>
-        <w:t xml:space="preserve">(4), 625–636.</w:t>
-      </w:r>
-      <w:r>
-        <w:t xml:space="preserve"> </w:t>
-      </w:r>
-      <w:hyperlink r:id="rId146">
-        <w:r>
-          <w:rPr>
-            <w:rStyle w:val="Hyperlink"/>
-          </w:rPr>
-          <w:t xml:space="preserve">https://doi.org/10.3758/BF03196322</w:t>
-        </w:r>
-      </w:hyperlink>
-    </w:p>
-    <w:bookmarkEnd w:id="147"/>
-    <w:bookmarkStart w:id="149" w:name="ref-zwaan_embodiment_2014"/>
-    <w:p>
-      <w:pPr>
-        <w:pStyle w:val="Literaturverzeichnis"/>
-      </w:pPr>
-      <w:r>
-        <w:t xml:space="preserve">Zwaan, R. A. (2014a). Embodiment and language comprehension: Reframing the discussion.</w:t>
-      </w:r>
-      <w:r>
-        <w:t xml:space="preserve"> </w:t>
-      </w:r>
-      <w:r>
-        <w:rPr>
-          <w:i/>
-          <w:iCs/>
-        </w:rPr>
-        <w:t xml:space="preserve">Trends in Cognitive Sciences</w:t>
-      </w:r>
-      <w:r>
-        <w:t xml:space="preserve">,</w:t>
-      </w:r>
-      <w:r>
-        <w:t xml:space="preserve"> </w:t>
-      </w:r>
-      <w:r>
-        <w:rPr>
-          <w:i/>
-          <w:iCs/>
-        </w:rPr>
         <w:t xml:space="preserve">18</w:t>
       </w:r>
       <w:r>
@@ -15812,7 +15667,7 @@
       <w:r>
         <w:t xml:space="preserve"> </w:t>
       </w:r>
-      <w:hyperlink r:id="rId148">
+      <w:hyperlink r:id="rId144">
         <w:r>
           <w:rPr>
             <w:rStyle w:val="Hyperlink"/>
@@ -15821,8 +15676,8 @@
         </w:r>
       </w:hyperlink>
     </w:p>
-    <w:bookmarkEnd w:id="149"/>
-    <w:bookmarkStart w:id="151" w:name="ref-zwaanReplicationsShouldBe2014"/>
+    <w:bookmarkEnd w:id="145"/>
+    <w:bookmarkStart w:id="147" w:name="ref-zwaanReplicationsShouldBe2014"/>
     <w:p>
       <w:pPr>
         <w:pStyle w:val="Literaturverzeichnis"/>
@@ -15922,7 +15777,7 @@
       <w:r>
         <w:t xml:space="preserve"> </w:t>
       </w:r>
-      <w:hyperlink r:id="rId150">
+      <w:hyperlink r:id="rId146">
         <w:r>
           <w:rPr>
             <w:rStyle w:val="Hyperlink"/>
@@ -15931,8 +15786,8 @@
         </w:r>
       </w:hyperlink>
     </w:p>
-    <w:bookmarkEnd w:id="151"/>
-    <w:bookmarkStart w:id="153" w:name="X528c6e4aabb368acf74b9713b7fea9efbcd7c17"/>
+    <w:bookmarkEnd w:id="147"/>
+    <w:bookmarkStart w:id="149" w:name="X528c6e4aabb368acf74b9713b7fea9efbcd7c17"/>
     <w:p>
       <w:pPr>
         <w:pStyle w:val="Literaturverzeichnis"/>
@@ -15968,7 +15823,7 @@
       <w:r>
         <w:t xml:space="preserve"> </w:t>
       </w:r>
-      <w:hyperlink r:id="rId152">
+      <w:hyperlink r:id="rId148">
         <w:r>
           <w:rPr>
             <w:rStyle w:val="Hyperlink"/>
@@ -15977,8 +15832,8 @@
         </w:r>
       </w:hyperlink>
     </w:p>
-    <w:bookmarkEnd w:id="153"/>
-    <w:bookmarkStart w:id="154" w:name="X892f5e6f643d6edffc7dcb20d46d5a0b7b6fb0d"/>
+    <w:bookmarkEnd w:id="149"/>
+    <w:bookmarkStart w:id="150" w:name="X892f5e6f643d6edffc7dcb20d46d5a0b7b6fb0d"/>
     <w:p>
       <w:pPr>
         <w:pStyle w:val="Literaturverzeichnis"/>
@@ -16040,8 +15895,8 @@
         <w:t xml:space="preserve">.</w:t>
       </w:r>
     </w:p>
-    <w:bookmarkEnd w:id="154"/>
-    <w:bookmarkStart w:id="156" w:name="ref-zwaanRevisitingMentalSimulation2012"/>
+    <w:bookmarkEnd w:id="150"/>
+    <w:bookmarkStart w:id="152" w:name="ref-zwaanRevisitingMentalSimulation2012"/>
     <w:p>
       <w:pPr>
         <w:pStyle w:val="Literaturverzeichnis"/>
@@ -16078,7 +15933,7 @@
       <w:r>
         <w:t xml:space="preserve"> </w:t>
       </w:r>
-      <w:hyperlink r:id="rId155">
+      <w:hyperlink r:id="rId151">
         <w:r>
           <w:rPr>
             <w:rStyle w:val="Hyperlink"/>
@@ -16087,8 +15942,8 @@
         </w:r>
       </w:hyperlink>
     </w:p>
-    <w:bookmarkEnd w:id="156"/>
-    <w:bookmarkStart w:id="158" w:name="X35827a6db5f501998ff767862cb65336c730716"/>
+    <w:bookmarkEnd w:id="152"/>
+    <w:bookmarkStart w:id="154" w:name="X35827a6db5f501998ff767862cb65336c730716"/>
     <w:p>
       <w:pPr>
         <w:pStyle w:val="Literaturverzeichnis"/>
@@ -16125,7 +15980,7 @@
       <w:r>
         <w:t xml:space="preserve"> </w:t>
       </w:r>
-      <w:hyperlink r:id="rId157">
+      <w:hyperlink r:id="rId153">
         <w:r>
           <w:rPr>
             <w:rStyle w:val="Hyperlink"/>
@@ -16134,8 +15989,8 @@
         </w:r>
       </w:hyperlink>
     </w:p>
-    <w:bookmarkEnd w:id="158"/>
-    <w:bookmarkStart w:id="160" w:name="ref-zwaanReadersConstructSpatial1993"/>
+    <w:bookmarkEnd w:id="154"/>
+    <w:bookmarkStart w:id="156" w:name="ref-zwaanReadersConstructSpatial1993"/>
     <w:p>
       <w:pPr>
         <w:pStyle w:val="Literaturverzeichnis"/>
@@ -16172,7 +16027,7 @@
       <w:r>
         <w:t xml:space="preserve"> </w:t>
       </w:r>
-      <w:hyperlink r:id="rId159">
+      <w:hyperlink r:id="rId155">
         <w:r>
           <w:rPr>
             <w:rStyle w:val="Hyperlink"/>
@@ -16181,15 +16036,15 @@
         </w:r>
       </w:hyperlink>
     </w:p>
-    <w:bookmarkEnd w:id="160"/>
-    <w:bookmarkEnd w:id="161"/>
+    <w:bookmarkEnd w:id="156"/>
+    <w:bookmarkEnd w:id="157"/>
     <w:p>
       <w:r>
         <w:br w:type="page"/>
       </w:r>
     </w:p>
-    <w:bookmarkEnd w:id="162"/>
-    <w:bookmarkStart w:id="163" w:name="appendix-appendix"/>
+    <w:bookmarkEnd w:id="158"/>
+    <w:bookmarkStart w:id="159" w:name="appendix-appendix"/>
     <w:p>
       <w:pPr>
         <w:pStyle w:val="berschrift1"/>
@@ -16198,8 +16053,8 @@
         <w:t xml:space="preserve">(APPENDIX) Appendix</w:t>
       </w:r>
     </w:p>
-    <w:bookmarkEnd w:id="163"/>
-    <w:bookmarkStart w:id="169" w:name="sensitivity-analyses"/>
+    <w:bookmarkEnd w:id="159"/>
+    <w:bookmarkStart w:id="165" w:name="sensitivity-analyses"/>
     <w:p>
       <w:pPr>
         <w:pStyle w:val="berschrift1"/>
@@ -16216,7 +16071,7 @@
         <w:t xml:space="preserve">The R codes for the sensitivity analysis on the trial level were written by Erin M. Buchanan.</w:t>
       </w:r>
     </w:p>
-    <w:bookmarkStart w:id="164" w:name="load-data-and-run-models"/>
+    <w:bookmarkStart w:id="160" w:name="load-data-and-run-models"/>
     <w:p>
       <w:pPr>
         <w:pStyle w:val="berschrift2"/>
@@ -16233,8 +16088,8 @@
         <w:t xml:space="preserve">The data for the sensitivity analysis shared the same exclusion criterion for the pre-registered mixed-effects models. The first step is to determine if there is a minimum number of trials required for stable results.</w:t>
       </w:r>
     </w:p>
-    <w:bookmarkEnd w:id="164"/>
-    <w:bookmarkStart w:id="167" w:name="view-the-results"/>
+    <w:bookmarkEnd w:id="160"/>
+    <w:bookmarkStart w:id="163" w:name="view-the-results"/>
     <w:p>
       <w:pPr>
         <w:pStyle w:val="berschrift2"/>
@@ -16243,7 +16098,7 @@
         <w:t xml:space="preserve">View the Results</w:t>
       </w:r>
     </w:p>
-    <w:bookmarkStart w:id="165" w:name="b-values"/>
+    <w:bookmarkStart w:id="161" w:name="b-values"/>
     <w:p>
       <w:pPr>
         <w:pStyle w:val="berschrift3"/>
@@ -16284,8 +16139,8 @@
         <w:t xml:space="preserve">-0.17, -0.17, -0.17, -0.17, -0.18, -0.12, 0.49, -0.14, 0.67, and 3.11</w:t>
       </w:r>
     </w:p>
-    <w:bookmarkEnd w:id="165"/>
-    <w:bookmarkStart w:id="166" w:name="p-values"/>
+    <w:bookmarkEnd w:id="161"/>
+    <w:bookmarkStart w:id="162" w:name="p-values"/>
     <w:p>
       <w:pPr>
         <w:pStyle w:val="berschrift3"/>
@@ -16347,9 +16202,9 @@
         <w:t xml:space="preserve">-values indicates that no coefficients would have been considered significant.</w:t>
       </w:r>
     </w:p>
-    <w:bookmarkEnd w:id="166"/>
-    <w:bookmarkEnd w:id="167"/>
-    <w:bookmarkStart w:id="168" w:name="calculate-the-sensitivity"/>
+    <w:bookmarkEnd w:id="162"/>
+    <w:bookmarkEnd w:id="163"/>
+    <w:bookmarkStart w:id="164" w:name="calculate-the-sensitivity"/>
     <w:p>
       <w:pPr>
         <w:pStyle w:val="berschrift2"/>
@@ -16377,9 +16232,9 @@
         <w:t xml:space="preserve">## [1] 2.356441</w:t>
       </w:r>
     </w:p>
-    <w:bookmarkEnd w:id="168"/>
-    <w:bookmarkEnd w:id="169"/>
-    <w:bookmarkStart w:id="176" w:name="data-collection-logs"/>
+    <w:bookmarkEnd w:id="164"/>
+    <w:bookmarkEnd w:id="165"/>
+    <w:bookmarkStart w:id="172" w:name="data-collection-logs"/>
     <w:p>
       <w:pPr>
         <w:pStyle w:val="berschrift1"/>
@@ -16398,7 +16253,7 @@
       <w:r>
         <w:t xml:space="preserve"> </w:t>
       </w:r>
-      <w:hyperlink r:id="rId170">
+      <w:hyperlink r:id="rId166">
         <w:r>
           <w:rPr>
             <w:rStyle w:val="Hyperlink"/>
@@ -16473,7 +16328,7 @@
       <w:r>
         <w:t xml:space="preserve"> </w:t>
       </w:r>
-      <w:hyperlink r:id="rId171">
+      <w:hyperlink r:id="rId167">
         <w:r>
           <w:rPr>
             <w:rStyle w:val="Hyperlink"/>
@@ -16520,7 +16375,7 @@
       <w:r>
         <w:t xml:space="preserve"> </w:t>
       </w:r>
-      <w:hyperlink r:id="rId171">
+      <w:hyperlink r:id="rId167">
         <w:r>
           <w:rPr>
             <w:rStyle w:val="Hyperlink"/>
@@ -16565,7 +16420,7 @@
         <w:t xml:space="preserve">Some mistakes happened between the collaborators’ communications and required advanced data wrangling. For example, some AUS_091 participants were assigned to NZL_005. The Rmd file in NZL_005 folder were used to identify the AUS_091 participants’ data then move them to AUS_091 folder.</w:t>
       </w:r>
     </w:p>
-    <w:bookmarkStart w:id="172" w:name="datasets"/>
+    <w:bookmarkStart w:id="168" w:name="datasets"/>
     <w:p>
       <w:pPr>
         <w:pStyle w:val="berschrift2"/>
@@ -16611,8 +16466,8 @@
         <w:t xml:space="preserve">.</w:t>
       </w:r>
     </w:p>
-    <w:bookmarkEnd w:id="172"/>
-    <w:bookmarkStart w:id="173" w:name="flunecy-test-for-the-online-study"/>
+    <w:bookmarkEnd w:id="168"/>
+    <w:bookmarkStart w:id="169" w:name="flunecy-test-for-the-online-study"/>
     <w:p>
       <w:pPr>
         <w:pStyle w:val="berschrift2"/>
@@ -16732,8 +16587,8 @@
         <w:t xml:space="preserve">C: Judge sentences for their accuracy</w:t>
       </w:r>
     </w:p>
-    <w:bookmarkEnd w:id="173"/>
-    <w:bookmarkStart w:id="175" w:name="distributions-of-scripts"/>
+    <w:bookmarkEnd w:id="169"/>
+    <w:bookmarkStart w:id="171" w:name="distributions-of-scripts"/>
     <w:p>
       <w:pPr>
         <w:pStyle w:val="berschrift2"/>
@@ -16781,7 +16636,7 @@
       <w:r>
         <w:t xml:space="preserve">package in OpenSesame. We rent an remote server for the distributions during the data collection period. Any researcher would distribute the scripts on a free jatos server such as MindProbe (</w:t>
       </w:r>
-      <w:hyperlink r:id="rId174">
+      <w:hyperlink r:id="rId170">
         <w:r>
           <w:rPr>
             <w:rStyle w:val="Hyperlink"/>
@@ -16793,9 +16648,9 @@
         <w:t xml:space="preserve">).</w:t>
       </w:r>
     </w:p>
-    <w:bookmarkEnd w:id="175"/>
-    <w:bookmarkEnd w:id="176"/>
-    <w:bookmarkStart w:id="180" w:name="demographic-characteristics-by-language"/>
+    <w:bookmarkEnd w:id="171"/>
+    <w:bookmarkEnd w:id="172"/>
+    <w:bookmarkStart w:id="176" w:name="demographic-characteristics-by-language"/>
     <w:p>
       <w:pPr>
         <w:pStyle w:val="berschrift1"/>
@@ -16808,8 +16663,8 @@
       <w:pPr>
         <w:pStyle w:val="TableCaption"/>
       </w:pPr>
-      <w:bookmarkStart w:id="177" w:name="tab:print-part1"/>
-      <w:bookmarkEnd w:id="177"/>
+      <w:bookmarkStart w:id="173" w:name="tab:print-part1"/>
+      <w:bookmarkEnd w:id="173"/>
       <w:r>
         <w:t xml:space="preserve">Table 4</w:t>
       </w:r>
@@ -19135,8 +18990,8 @@
       <w:pPr>
         <w:pStyle w:val="TableCaption"/>
       </w:pPr>
-      <w:bookmarkStart w:id="178" w:name="tab:print-part2"/>
-      <w:bookmarkEnd w:id="178"/>
+      <w:bookmarkStart w:id="174" w:name="tab:print-part2"/>
+      <w:bookmarkEnd w:id="174"/>
       <w:r>
         <w:t xml:space="preserve">Table 5</w:t>
       </w:r>
@@ -22072,8 +21927,8 @@
       <w:pPr>
         <w:pStyle w:val="TableCaption"/>
       </w:pPr>
-      <w:bookmarkStart w:id="179" w:name="tab:print-part3"/>
-      <w:bookmarkEnd w:id="179"/>
+      <w:bookmarkStart w:id="175" w:name="tab:print-part3"/>
+      <w:bookmarkEnd w:id="175"/>
       <w:r>
         <w:t xml:space="preserve">Table 6</w:t>
       </w:r>
@@ -24390,8 +24245,8 @@
         <w:t xml:space="preserve"> </w:t>
       </w:r>
     </w:p>
-    <w:bookmarkEnd w:id="180"/>
-    <w:bookmarkStart w:id="189" w:name="model-estimates-for-mental-simulation"/>
+    <w:bookmarkEnd w:id="176"/>
+    <w:bookmarkStart w:id="185" w:name="model-estimates-for-mental-simulation"/>
     <w:p>
       <w:pPr>
         <w:pStyle w:val="berschrift1"/>
@@ -24444,8 +24299,8 @@
       <w:pPr>
         <w:pStyle w:val="TableCaption"/>
       </w:pPr>
-      <w:bookmarkStart w:id="181" w:name="tab:intercept"/>
-      <w:bookmarkEnd w:id="181"/>
+      <w:bookmarkStart w:id="177" w:name="tab:intercept"/>
+      <w:bookmarkEnd w:id="177"/>
       <w:r>
         <w:t xml:space="preserve">Table 7</w:t>
       </w:r>
@@ -24680,8 +24535,8 @@
       <w:pPr>
         <w:pStyle w:val="TableCaption"/>
       </w:pPr>
-      <w:bookmarkStart w:id="182" w:name="tab:subject"/>
-      <w:bookmarkEnd w:id="182"/>
+      <w:bookmarkStart w:id="178" w:name="tab:subject"/>
+      <w:bookmarkEnd w:id="178"/>
       <w:r>
         <w:t xml:space="preserve">Table 8</w:t>
       </w:r>
@@ -25184,8 +25039,8 @@
       <w:pPr>
         <w:pStyle w:val="TableCaption"/>
       </w:pPr>
-      <w:bookmarkStart w:id="183" w:name="tab:item"/>
-      <w:bookmarkEnd w:id="183"/>
+      <w:bookmarkStart w:id="179" w:name="tab:item"/>
+      <w:bookmarkEnd w:id="179"/>
       <w:r>
         <w:t xml:space="preserve">Table 9</w:t>
       </w:r>
@@ -25810,8 +25665,8 @@
       <w:pPr>
         <w:pStyle w:val="TableCaption"/>
       </w:pPr>
-      <w:bookmarkStart w:id="184" w:name="tab:lab"/>
-      <w:bookmarkEnd w:id="184"/>
+      <w:bookmarkStart w:id="180" w:name="tab:lab"/>
+      <w:bookmarkEnd w:id="180"/>
       <w:r>
         <w:t xml:space="preserve">Table 10</w:t>
       </w:r>
@@ -26544,8 +26399,8 @@
       <w:pPr>
         <w:pStyle w:val="TableCaption"/>
       </w:pPr>
-      <w:bookmarkStart w:id="185" w:name="tab:lang"/>
-      <w:bookmarkEnd w:id="185"/>
+      <w:bookmarkStart w:id="181" w:name="tab:lang"/>
+      <w:bookmarkEnd w:id="181"/>
       <w:r>
         <w:t xml:space="preserve">Table 11</w:t>
       </w:r>
@@ -27386,8 +27241,8 @@
       <w:pPr>
         <w:pStyle w:val="TableCaption"/>
       </w:pPr>
-      <w:bookmarkStart w:id="186" w:name="tab:fixed"/>
-      <w:bookmarkEnd w:id="186"/>
+      <w:bookmarkStart w:id="182" w:name="tab:fixed"/>
+      <w:bookmarkEnd w:id="182"/>
       <w:r>
         <w:t xml:space="preserve">Table 12</w:t>
       </w:r>
@@ -28176,8 +28031,8 @@
       <w:pPr>
         <w:pStyle w:val="TableCaption"/>
       </w:pPr>
-      <w:bookmarkStart w:id="187" w:name="tab:german-random"/>
-      <w:bookmarkEnd w:id="187"/>
+      <w:bookmarkStart w:id="183" w:name="tab:german-random"/>
+      <w:bookmarkEnd w:id="183"/>
       <w:r>
         <w:t xml:space="preserve">Table 13</w:t>
       </w:r>
@@ -28882,8 +28737,8 @@
       <w:pPr>
         <w:pStyle w:val="TableCaption"/>
       </w:pPr>
-      <w:bookmarkStart w:id="188" w:name="tab:german-fixed"/>
-      <w:bookmarkEnd w:id="188"/>
+      <w:bookmarkStart w:id="184" w:name="tab:german-fixed"/>
+      <w:bookmarkEnd w:id="184"/>
       <w:r>
         <w:t xml:space="preserve">Table 14</w:t>
       </w:r>
@@ -29681,8 +29536,8 @@
         </w:tc>
       </w:tr>
     </w:tbl>
-    <w:bookmarkEnd w:id="189"/>
-    <w:bookmarkStart w:id="190" w:name="model-estimates-for-mental-rotation"/>
+    <w:bookmarkEnd w:id="185"/>
+    <w:bookmarkStart w:id="186" w:name="model-estimates-for-mental-rotation"/>
     <w:p>
       <w:pPr>
         <w:pStyle w:val="berschrift1"/>
@@ -39084,8 +38939,8 @@
         </w:tc>
       </w:tr>
     </w:tbl>
-    <w:bookmarkEnd w:id="190"/>
-    <w:bookmarkStart w:id="191" w:name="additional-references"/>
+    <w:bookmarkEnd w:id="186"/>
+    <w:bookmarkStart w:id="187" w:name="additional-references"/>
     <w:p>
       <w:pPr>
         <w:pStyle w:val="berschrift1"/>
@@ -39107,7 +38962,7 @@
         <w:pStyle w:val="Textkrper"/>
       </w:pPr>
     </w:p>
-    <w:bookmarkEnd w:id="191"/>
+    <w:bookmarkEnd w:id="187"/>
     <w:sectPr>
       <w:headerReference r:id="rId9" w:type="even"/>
       <w:headerReference r:id="rId11" w:type="default"/>

</xml_diff>